<commit_message>
fix: change time in docx
</commit_message>
<xml_diff>
--- a/documents/CV.docx
+++ b/documents/CV.docx
@@ -1572,7 +1572,20 @@
           <w:szCs w:val="20"/>
           <w:u w:val="single"/>
         </w:rPr>
-        <w:t xml:space="preserve">/2024, </w:t>
+        <w:t>/2023</w:t>
+      </w:r>
+      <w:bookmarkStart w:id="0" w:name="_GoBack"/>
+      <w:bookmarkEnd w:id="0"/>
+      <w:r>
+        <w:rPr>
+          <w:rFonts w:ascii="Calibri" w:hAnsi="Calibri" w:cs="Calibri"/>
+          <w:b/>
+          <w:bCs/>
+          <w:sz w:val="20"/>
+          <w:szCs w:val="20"/>
+          <w:u w:val="single"/>
+        </w:rPr>
+        <w:t xml:space="preserve">, </w:t>
       </w:r>
       <w:proofErr w:type="spellStart"/>
       <w:r>
@@ -2055,12 +2068,9 @@
           <w:sz w:val="20"/>
           <w:szCs w:val="20"/>
           <w:u w:val="single"/>
-          <w:lang w:val="en-US"/>
         </w:rPr>
         <w:t>4</w:t>
       </w:r>
-      <w:bookmarkStart w:id="0" w:name="_GoBack"/>
-      <w:bookmarkEnd w:id="0"/>
       <w:r>
         <w:rPr>
           <w:rFonts w:ascii="Calibri" w:hAnsi="Calibri" w:cs="Calibri"/>
@@ -10078,7 +10088,7 @@
 </file>
 
 <file path=customXml/itemProps1.xml><?xml version="1.0" encoding="utf-8"?>
-<ds:datastoreItem xmlns:ds="http://schemas.openxmlformats.org/officeDocument/2006/customXml" ds:itemID="{3DD53D93-4670-4326-A4C6-ED9CF4B72ACE}">
+<ds:datastoreItem xmlns:ds="http://schemas.openxmlformats.org/officeDocument/2006/customXml" ds:itemID="{A39FD91D-CFA8-45E0-8A9E-8EECB29C0773}">
   <ds:schemaRefs>
     <ds:schemaRef ds:uri="http://schemas.openxmlformats.org/officeDocument/2006/bibliography"/>
   </ds:schemaRefs>

</xml_diff>

<commit_message>
fix: add translate words for  authorisation
</commit_message>
<xml_diff>
--- a/documents/CV.docx
+++ b/documents/CV.docx
@@ -181,6 +181,7 @@
           <w:rFonts w:ascii="Calibri" w:hAnsi="Calibri" w:cs="Calibri"/>
           <w:sz w:val="20"/>
           <w:szCs w:val="20"/>
+          <w:lang w:val="en-US"/>
         </w:rPr>
       </w:pPr>
       <w:r>
@@ -197,6 +198,7 @@
           <w:rFonts w:ascii="Calibri" w:hAnsi="Calibri" w:cs="Calibri"/>
           <w:sz w:val="20"/>
           <w:szCs w:val="20"/>
+          <w:lang w:val="en-US"/>
         </w:rPr>
         <w:t>: @</w:t>
       </w:r>
@@ -307,102 +309,92 @@
     </w:p>
     <w:p>
       <w:pPr>
-        <w:pStyle w:val="Empty"/>
-        <w:rPr>
-          <w:rFonts w:ascii="Calibri" w:hAnsi="Calibri" w:cs="Calibri"/>
-          <w:sz w:val="20"/>
-          <w:szCs w:val="20"/>
-        </w:rPr>
-      </w:pPr>
-      <w:r>
-        <w:rPr>
-          <w:rFonts w:ascii="Calibri" w:hAnsi="Calibri" w:cs="Calibri"/>
-          <w:sz w:val="20"/>
-          <w:szCs w:val="20"/>
-        </w:rPr>
-        <w:t>Имею 1 год опыта создания веб-приложений (</w:t>
-      </w:r>
+        <w:rPr>
+          <w:rFonts w:ascii="Calibri" w:hAnsi="Calibri" w:cs="Calibri"/>
+        </w:rPr>
+      </w:pPr>
       <w:proofErr w:type="spellStart"/>
       <w:r>
         <w:rPr>
           <w:rFonts w:ascii="Calibri" w:hAnsi="Calibri" w:cs="Calibri"/>
-          <w:sz w:val="20"/>
-          <w:szCs w:val="20"/>
-        </w:rPr>
-        <w:t>freelance</w:t>
+          <w:color w:val="000000"/>
+          <w:sz w:val="20"/>
+          <w:szCs w:val="20"/>
+        </w:rPr>
+        <w:t>Frontend</w:t>
       </w:r>
       <w:proofErr w:type="spellEnd"/>
       <w:r>
         <w:rPr>
           <w:rFonts w:ascii="Calibri" w:hAnsi="Calibri" w:cs="Calibri"/>
-          <w:sz w:val="20"/>
-          <w:szCs w:val="20"/>
-        </w:rPr>
-        <w:t>). Проходил стажировку в</w:t>
-      </w:r>
-    </w:p>
-    <w:p>
-      <w:pPr>
-        <w:pStyle w:val="Empty"/>
-        <w:rPr>
-          <w:rFonts w:ascii="Calibri" w:hAnsi="Calibri" w:cs="Calibri"/>
-          <w:sz w:val="20"/>
-          <w:szCs w:val="20"/>
-        </w:rPr>
-      </w:pPr>
+          <w:color w:val="000000"/>
+          <w:sz w:val="20"/>
+          <w:szCs w:val="20"/>
+        </w:rPr>
+        <w:t xml:space="preserve"> разработчик, опыт создания веб-приложений 1 год.</w:t>
+      </w:r>
+    </w:p>
+    <w:p>
+      <w:pPr>
+        <w:rPr>
+          <w:rFonts w:ascii="Calibri" w:hAnsi="Calibri" w:cs="Calibri"/>
+        </w:rPr>
+      </w:pPr>
+      <w:r>
+        <w:rPr>
+          <w:rFonts w:ascii="Calibri" w:hAnsi="Calibri" w:cs="Calibri"/>
+          <w:color w:val="000000"/>
+          <w:sz w:val="20"/>
+          <w:szCs w:val="20"/>
+        </w:rPr>
+        <w:t>Открыт к любым предложениям (работа в штате, по договору подряда,</w:t>
+      </w:r>
+      <w:r>
+        <w:rPr>
+          <w:rFonts w:ascii="Calibri" w:hAnsi="Calibri" w:cs="Calibri"/>
+          <w:color w:val="000000"/>
+          <w:sz w:val="20"/>
+          <w:szCs w:val="20"/>
+        </w:rPr>
+        <w:t xml:space="preserve"> </w:t>
+      </w:r>
       <w:proofErr w:type="spellStart"/>
       <w:r>
         <w:rPr>
           <w:rFonts w:ascii="Calibri" w:hAnsi="Calibri" w:cs="Calibri"/>
-          <w:sz w:val="20"/>
-          <w:szCs w:val="20"/>
-        </w:rPr>
-        <w:t>TechInLab</w:t>
+          <w:color w:val="000000"/>
+          <w:sz w:val="20"/>
+          <w:szCs w:val="20"/>
+        </w:rPr>
+        <w:t>самозанятость</w:t>
       </w:r>
       <w:proofErr w:type="spellEnd"/>
       <w:r>
         <w:rPr>
           <w:rFonts w:ascii="Calibri" w:hAnsi="Calibri" w:cs="Calibri"/>
-          <w:sz w:val="20"/>
-          <w:szCs w:val="20"/>
-        </w:rPr>
-        <w:t xml:space="preserve"> (01/2024 – 04/2024).</w:t>
-      </w:r>
-    </w:p>
-    <w:p>
-      <w:pPr>
-        <w:pStyle w:val="Empty"/>
-        <w:rPr>
-          <w:rFonts w:ascii="Calibri" w:hAnsi="Calibri" w:cs="Calibri"/>
-          <w:sz w:val="20"/>
-          <w:szCs w:val="20"/>
-        </w:rPr>
-      </w:pPr>
-      <w:r>
-        <w:rPr>
-          <w:rFonts w:ascii="Calibri" w:hAnsi="Calibri" w:cs="Calibri"/>
-          <w:sz w:val="20"/>
-          <w:szCs w:val="20"/>
-        </w:rPr>
-        <w:t xml:space="preserve">Принял решение перейти с </w:t>
-      </w:r>
-      <w:proofErr w:type="spellStart"/>
-      <w:r>
-        <w:rPr>
-          <w:rFonts w:ascii="Calibri" w:hAnsi="Calibri" w:cs="Calibri"/>
-          <w:sz w:val="20"/>
-          <w:szCs w:val="20"/>
-        </w:rPr>
-        <w:t>freelance</w:t>
-      </w:r>
-      <w:proofErr w:type="spellEnd"/>
-      <w:r>
-        <w:rPr>
-          <w:rFonts w:ascii="Calibri" w:hAnsi="Calibri" w:cs="Calibri"/>
-          <w:sz w:val="20"/>
-          <w:szCs w:val="20"/>
-        </w:rPr>
-        <w:t xml:space="preserve"> на официальное трудоустройство для получения более предсказуемой нагрузки и оптимизации рабочего графика.</w:t>
+          <w:color w:val="000000"/>
+          <w:sz w:val="20"/>
+          <w:szCs w:val="20"/>
+        </w:rPr>
+        <w:t>).</w:t>
+      </w:r>
+    </w:p>
+    <w:p>
+      <w:pPr>
+        <w:rPr>
+          <w:rFonts w:ascii="Calibri" w:hAnsi="Calibri" w:cs="Calibri"/>
+          <w:sz w:val="20"/>
+          <w:szCs w:val="20"/>
+        </w:rPr>
+      </w:pPr>
+      <w:r>
+        <w:rPr>
+          <w:rFonts w:ascii="Calibri" w:hAnsi="Calibri" w:cs="Calibri"/>
+          <w:color w:val="000000"/>
+          <w:sz w:val="20"/>
+          <w:szCs w:val="20"/>
+        </w:rPr>
+        <w:t>Рассмотрю вариант стажировки.</w:t>
       </w:r>
       <w:r>
         <w:rPr>
@@ -440,6 +432,8 @@
         </w:rPr>
         <w:t xml:space="preserve"> и онлайн конкурсах по веб-разработке.</w:t>
       </w:r>
+      <w:bookmarkStart w:id="0" w:name="_GoBack"/>
+      <w:bookmarkEnd w:id="0"/>
     </w:p>
     <w:p>
       <w:pPr>
@@ -1262,8 +1256,6 @@
         </w:rPr>
         <w:t xml:space="preserve">01/2024 – 04/2024, </w:t>
       </w:r>
-      <w:bookmarkStart w:id="0" w:name="_GoBack"/>
-      <w:bookmarkEnd w:id="0"/>
       <w:proofErr w:type="spellStart"/>
       <w:r>
         <w:rPr>
@@ -3309,7 +3301,6 @@
           <w:rFonts w:ascii="Calibri" w:hAnsi="Calibri" w:cs="Calibri"/>
           <w:sz w:val="20"/>
           <w:szCs w:val="20"/>
-          <w:lang w:val="en-US"/>
         </w:rPr>
       </w:pPr>
       <w:r>
@@ -3325,7 +3316,6 @@
           <w:rFonts w:ascii="Calibri" w:hAnsi="Calibri" w:cs="Calibri"/>
           <w:sz w:val="20"/>
           <w:szCs w:val="20"/>
-          <w:lang w:val="en-US"/>
         </w:rPr>
         <w:t xml:space="preserve">: </w:t>
       </w:r>
@@ -3345,7 +3335,6 @@
           <w:rFonts w:ascii="Calibri" w:hAnsi="Calibri" w:cs="Calibri"/>
           <w:sz w:val="20"/>
           <w:szCs w:val="20"/>
-          <w:lang w:val="en-US"/>
         </w:rPr>
         <w:t xml:space="preserve">, </w:t>
       </w:r>
@@ -3365,7 +3354,6 @@
           <w:rFonts w:ascii="Calibri" w:hAnsi="Calibri" w:cs="Calibri"/>
           <w:sz w:val="20"/>
           <w:szCs w:val="20"/>
-          <w:lang w:val="en-US"/>
         </w:rPr>
         <w:t xml:space="preserve">, </w:t>
       </w:r>
@@ -3385,7 +3373,6 @@
           <w:rFonts w:ascii="Calibri" w:hAnsi="Calibri" w:cs="Calibri"/>
           <w:sz w:val="20"/>
           <w:szCs w:val="20"/>
-          <w:lang w:val="en-US"/>
         </w:rPr>
         <w:t>.</w:t>
       </w:r>
@@ -3394,15 +3381,13 @@
       <w:pPr>
         <w:rPr>
           <w:rFonts w:ascii="Calibri" w:hAnsi="Calibri" w:cs="Calibri"/>
-          <w:lang w:val="en-US"/>
-        </w:rPr>
-      </w:pPr>
-    </w:p>
-    <w:p>
-      <w:pPr>
-        <w:rPr>
-          <w:rFonts w:ascii="Calibri" w:hAnsi="Calibri" w:cs="Calibri"/>
-          <w:lang w:val="en-US"/>
+        </w:rPr>
+      </w:pPr>
+    </w:p>
+    <w:p>
+      <w:pPr>
+        <w:rPr>
+          <w:rFonts w:ascii="Calibri" w:hAnsi="Calibri" w:cs="Calibri"/>
         </w:rPr>
       </w:pPr>
     </w:p>
@@ -3418,7 +3403,6 @@
           <w:sz w:val="20"/>
           <w:szCs w:val="20"/>
           <w:u w:val="single"/>
-          <w:lang w:val="en-US"/>
         </w:rPr>
       </w:pPr>
       <w:r>
@@ -3440,7 +3424,6 @@
           <w:sz w:val="20"/>
           <w:szCs w:val="20"/>
           <w:u w:val="single"/>
-          <w:lang w:val="en-US"/>
         </w:rPr>
         <w:t xml:space="preserve"> </w:t>
       </w:r>
@@ -3463,7 +3446,6 @@
           <w:sz w:val="20"/>
           <w:szCs w:val="20"/>
           <w:u w:val="single"/>
-          <w:lang w:val="en-US"/>
         </w:rPr>
         <w:t>:</w:t>
       </w:r>
@@ -3480,7 +3462,6 @@
           <w:sz w:val="20"/>
           <w:szCs w:val="20"/>
           <w:u w:val="single"/>
-          <w:lang w:val="en-US"/>
         </w:rPr>
       </w:pPr>
     </w:p>
@@ -9928,7 +9909,7 @@
 </file>
 
 <file path=customXml/itemProps1.xml><?xml version="1.0" encoding="utf-8"?>
-<ds:datastoreItem xmlns:ds="http://schemas.openxmlformats.org/officeDocument/2006/customXml" ds:itemID="{B9C76DB9-9BC9-4991-85A6-2E41F7A4670C}">
+<ds:datastoreItem xmlns:ds="http://schemas.openxmlformats.org/officeDocument/2006/customXml" ds:itemID="{C1E64778-4B13-43B6-8A6D-16A615A97C65}">
   <ds:schemaRefs>
     <ds:schemaRef ds:uri="http://schemas.openxmlformats.org/officeDocument/2006/bibliography"/>
   </ds:schemaRefs>

</xml_diff>